<commit_message>
feat: remove documentos desatualizados e corrige formatação de relatórios financeiros
</commit_message>
<xml_diff>
--- a/Módulo_1-Automação-Excel-e-Engenharia-de-Dados/9_automacao_de_processos_com_excel_em_python/documento3.docx
+++ b/Módulo_1-Automação-Excel-e-Engenharia-de-Dados/9_automacao_de_processos_com_excel_em_python/documento3.docx
@@ -7,7 +7,15 @@
         <w:pStyle w:val="Heading1"/>
       </w:pPr>
       <w:r>
-        <w:t>Relatório Financeiro</w:t>
+        <w:t>Relatorio Financeiro</w:t>
+      </w:r>
+    </w:p>
+    <w:p>
+      <w:pPr>
+        <w:pStyle w:val="Heading2"/>
+      </w:pPr>
+      <w:r>
+        <w:t>Período: 01-10 de Agosto de 2025</w:t>
       </w:r>
     </w:p>
     <w:tbl>
@@ -715,6 +723,14 @@
     <w:p>
       <w:r>
         <w:br w:type="page"/>
+      </w:r>
+    </w:p>
+    <w:p>
+      <w:pPr>
+        <w:pStyle w:val="Heading2"/>
+      </w:pPr>
+      <w:r>
+        <w:t>Periodo: 11-20 de Agosto de 2025</w:t>
       </w:r>
     </w:p>
     <w:tbl>

</xml_diff>